<commit_message>
Reader length check + test, live_view outage events, stale path fixes, doc corrections
</commit_message>
<xml_diff>
--- a/docs/Signyales_Hardware_Assembly_Guide.docx
+++ b/docs/Signyales_Hardware_Assembly_Guide.docx
@@ -2368,7 +2368,7 @@
           <w:sz w:val="24"/>
           <w:szCs w:val="24"/>
         </w:rPr>
-        <w:t xml:space="preserve">The receiver dongle connects to the Pi over a dedicated UART link, wired separately from the Pi's USB ports. Getting the crossed TX/RX wiring right, and completing the disable-bt configuration step described in the receiver firmware's README, are the two most common sources of “no data arriving” problems at this stage.</w:t>
+        <w:t xml:space="preserve">The receiver dongle connects to the Pi over a dedicated UART link, wired separately from the Pi's USB ports. Getting the crossed TX/RX wiring right, and enabling the Pi 5's hardware UART as described in the receiver firmware's README (use /dev/ttyAMA0 and verify it with a loopback test), are the two most common sources of “no data arriving” problems at this stage.</w:t>
       </w:r>
     </w:p>
     <w:p>
@@ -2529,7 +2529,7 @@
           <w:sz w:val="24"/>
           <w:szCs w:val="24"/>
         </w:rPr>
-        <w:t xml:space="preserve">5. Set up the Raspberry Pi 5: flash the OS, complete the disable-bt UART configuration, and verify /dev/serial0 exists before wiring anything to it.</w:t>
+        <w:t xml:space="preserve">5. Set up the Raspberry Pi 5: flash the OS, enable the hardware UART (add dtparam=uart0=on to /boot/firmware/config.txt and reboot), and verify /dev/ttyAMA0 with a GPIO14-to-GPIO15 loopback test before wiring the receiver. Do not rely on /dev/serial0, which points to a different connector on the Pi 5. Add dtoverlay=disable-bt only if the loopback test fails.</w:t>
       </w:r>
     </w:p>
     <w:p>
@@ -2543,7 +2543,7 @@
           <w:sz w:val="24"/>
           <w:szCs w:val="24"/>
         </w:rPr>
-        <w:t xml:space="preserve">6. Wire the receiver to the Pi's UART pins (crossed, plus shared ground) and confirm the hub application receives frames using `python -m signyales_hub.main -v` with no model yet required.</w:t>
+        <w:t xml:space="preserve">6. Wire the receiver to the Pi's UART pins (crossed, plus shared ground) and confirm frames are arriving using `python tools/live_view.py --port /dev/ttyAMA0` from the pi-side folder (no model required). The main app prints nothing per frame until a model is loaded.</w:t>
       </w:r>
     </w:p>
     <w:p>

</xml_diff>

<commit_message>
Docs: describe the hardware as built (original ESP32, 6 sensors, IMU on IO21/IO22, receiver on USB)
Hardware Assembly Guide: BOM rows, pin list, new wiring figures (glove as built;
receiver to Pi with USB default, UART option, wall power, monitor, USB sound card),
assembly steps and safety notes. Software Requirements and System Implementation:
original ESP32 / 6 sensors / 24 features / USB link / kiosk, decided toolchain and
TTS, updated hardware status. Handoff guide Stage 5 rewritten for the USB cable
(UART steps kept as the option), --port removed from commands, IMU and boot-loop
notes; test log form, cheat sheet, build walkthrough (Phase 8), root README and
pi-side README updated. Verification status: receiver link line. Project log:
28-29 Oct entry.
</commit_message>
<xml_diff>
--- a/docs/Signyales_Hardware_Assembly_Guide.docx
+++ b/docs/Signyales_Hardware_Assembly_Guide.docx
@@ -46,6 +46,20 @@
           <w:szCs w:val="24"/>
         </w:rPr>
         <w:t xml:space="preserve">This guide lists the components needed to physically build one complete Signyales unit (two gloves, one receiver dongle, one Raspberry Pi 5 hub) and shows how each subsystem is wired. Quantities below are per complete unit; multiply accordingly for additional units or spares. A note on cost: component prices, especially for the Raspberry Pi 5, have been volatile through 2026 due to global memory shortages affecting the wider single-board computer market, and prices in local electronics suppliers (e.g., e-Gizmo, Circuit Rocks, or online marketplaces) can differ substantially from official international list prices. Costs are intentionally left for you to fill in from a current local quote rather than quoted here, since a figure given today could be meaningfully wrong by the time this is read.</w:t>
+      </w:r>
+    </w:p>
+    <w:p>
+      <w:pPr>
+        <w:spacing w:after="200" w:line="360"/>
+        <w:jc w:val="both"/>
+      </w:pPr>
+      <w:r>
+        <w:rPr>
+          <w:rFonts w:ascii="Times New Roman" w:cs="Times New Roman" w:eastAsia="Times New Roman" w:hAnsi="Times New Roman"/>
+          <w:sz w:val="24"/>
+          <w:szCs w:val="24"/>
+        </w:rPr>
+        <w:t xml:space="preserve">Updated 29 October 2026 to the hardware as built. Changes from the proposal, confirmed with the adviser: the gloves use the original ESP32 (not the ESP32-S3) with 6 flex sensors each (5 fingers + 1 palm); the Raspberry Pi 5 runs on its wall supply; the receiver connects to the Pi with one USB cable by default; sound goes through a USB sound card to a wired speaker. Pin numbers below match firmware/glove/src/config.h.</w:t>
       </w:r>
     </w:p>
     <w:p>
@@ -174,7 +188,7 @@
                 <w:sz w:val="21"/>
                 <w:szCs w:val="21"/>
               </w:rPr>
-              <w:t xml:space="preserve">ESP32-S3 development board</w:t>
+              <w:t xml:space="preserve">ESP32 development board (original ESP32)</w:t>
             </w:r>
           </w:p>
         </w:tc>
@@ -220,7 +234,7 @@
                 <w:sz w:val="21"/>
                 <w:szCs w:val="21"/>
               </w:rPr>
-              <w:t xml:space="preserve">One per glove. Any ESP32-S3 DevKit variant with exposed ADC1-capable GPIOs works; confirm pin availability against config.h before ordering a non-standard board.</w:t>
+              <w:t xml:space="preserve">One per glove: ESP32-DevKitC-32E or a clone (CP210x USB chip), PlatformIO board esp32dev. Only the ADC1 pins (IO32–IO36, IO39) can be read while ESP-NOW transmits, which is why each glove has 6 flex sensors.</w:t>
             </w:r>
           </w:p>
         </w:tc>
@@ -268,7 +282,7 @@
                 <w:sz w:val="21"/>
                 <w:szCs w:val="21"/>
               </w:rPr>
-              <w:t xml:space="preserve">10</w:t>
+              <w:t xml:space="preserve">12</w:t>
             </w:r>
           </w:p>
         </w:tc>
@@ -291,7 +305,7 @@
                 <w:sz w:val="21"/>
                 <w:szCs w:val="21"/>
               </w:rPr>
-              <w:t xml:space="preserve">5 per glove, one per finger. Longer sensors are easier to mount across the full finger length but need more careful routing near the knuckle.</w:t>
+              <w:t xml:space="preserve">6 per glove: one per finger plus one across the palm (cupping, fist and finger-touch signs). Plug-in order J1 thumb, J2 index, J3 middle, J4 ring, J5 pinky, J6 palm. Longer sensors are easier to mount across the full finger length but need more careful routing near the knuckle; the palm sensor is the short 2.2″ type, and its orientation is still being decided.</w:t>
             </w:r>
           </w:p>
         </w:tc>
@@ -362,7 +376,7 @@
                 <w:sz w:val="21"/>
                 <w:szCs w:val="21"/>
               </w:rPr>
-              <w:t xml:space="preserve">One per glove. Confirm the breakout exposes AD0 (tie to GND for address 0x68, matching config.h).</w:t>
+              <w:t xml:space="preserve">One per glove (board marked "ITG/MPU", GY-521 type). SDA to IO21, SCL to IO22, AD0 to GND (address 0x68, matching config.h). Do not use IO12: it is a boot strapping pin and the IMU's pull-up on it stops the board from starting.</w:t>
             </w:r>
           </w:p>
         </w:tc>
@@ -387,7 +401,7 @@
                 <w:sz w:val="21"/>
                 <w:szCs w:val="21"/>
               </w:rPr>
-              <w:t xml:space="preserve">10kΩ resistor, 1/4W</w:t>
+              <w:t xml:space="preserve">47 kΩ resistor, 1/4 W</w:t>
             </w:r>
           </w:p>
         </w:tc>
@@ -410,7 +424,7 @@
                 <w:sz w:val="21"/>
                 <w:szCs w:val="21"/>
               </w:rPr>
-              <w:t xml:space="preserve">10</w:t>
+              <w:t xml:space="preserve">12</w:t>
             </w:r>
           </w:p>
         </w:tc>
@@ -433,7 +447,7 @@
                 <w:sz w:val="21"/>
                 <w:szCs w:val="21"/>
               </w:rPr>
-              <w:t xml:space="preserve">5 per glove, for the flex sensor voltage dividers. Buy a small assortment (1k–47k) in case the specific flex sensors need a different pulldown value.</w:t>
+              <w:t xml:space="preserve">6 per glove (R1–R6), for the flex sensor voltage dividers, as in the PCB schematic. 470 Ω, fitted at first, gives almost no reading change when a finger bends.</w:t>
             </w:r>
           </w:p>
         </w:tc>
@@ -504,7 +518,7 @@
                 <w:sz w:val="21"/>
                 <w:szCs w:val="21"/>
               </w:rPr>
-              <w:t xml:space="preserve">One per glove. Confirm polarity matches your specific ESP32-S3 board's battery connector before plugging in.</w:t>
+              <w:t xml:space="preserve">One per glove, connected through the glove's Li-ion charger / 5 V boost board. Confirm polarity before plugging in, and never power a glove from the charger's 5V OUT and USB at the same time.</w:t>
             </w:r>
           </w:p>
         </w:tc>
@@ -529,7 +543,7 @@
                 <w:sz w:val="21"/>
                 <w:szCs w:val="21"/>
               </w:rPr>
-              <w:t xml:space="preserve">Small protoboard/perfboard</w:t>
+              <w:t xml:space="preserve">Glove PCB (homemade FR4) or perfboard</w:t>
             </w:r>
           </w:p>
         </w:tc>
@@ -575,7 +589,7 @@
                 <w:sz w:val="21"/>
                 <w:szCs w:val="21"/>
               </w:rPr>
-              <w:t xml:space="preserve">One per glove, for a compact, semi-permanent version of the voltage divider wiring once the breadboard prototype is validated.</w:t>
+              <w:t xml:space="preserve">One per glove. As built: a homemade FR4 PCB with JST connectors J1–J7 for the flex sensors (J7 not used) and J8 for the charger's 5V OUT (not used yet). Prototype on a breadboard first.</w:t>
             </w:r>
           </w:p>
         </w:tc>
@@ -1037,7 +1051,7 @@
                 <w:sz w:val="21"/>
                 <w:szCs w:val="21"/>
               </w:rPr>
-              <w:t xml:space="preserve">Standard ESP32 DevKit (not S3-specific) is sufficient — the receiver only needs ESP-NOW and two spare UART-capable GPIOs.</w:t>
+              <w:t xml:space="preserve">30-pin ESP32-WROOM-32 DevKit with USB-C and a CH340 USB chip. It needs ESP-NOW and its USB port (the default link to the Pi); GPIO17/GPIO18 are used only for the UART option.</w:t>
             </w:r>
           </w:p>
         </w:tc>
@@ -1062,7 +1076,7 @@
                 <w:sz w:val="21"/>
                 <w:szCs w:val="21"/>
               </w:rPr>
-              <w:t xml:space="preserve">USB cable (data-capable, not charge-only)</w:t>
+              <w:t xml:space="preserve">USB-A to USB-C cable (data-capable, not charge-only)</w:t>
             </w:r>
           </w:p>
         </w:tc>
@@ -1108,7 +1122,7 @@
                 <w:sz w:val="21"/>
                 <w:szCs w:val="21"/>
               </w:rPr>
-              <w:t xml:space="preserve">For flashing firmware and, optionally, running receiver_link_logger.py during testing.</w:t>
+              <w:t xml:space="preserve">Connects the receiver to a Pi USB port: power and data (the default link). Also used for flashing the receiver from the laptop.</w:t>
             </w:r>
           </w:p>
         </w:tc>
@@ -1204,7 +1218,7 @@
                 <w:sz w:val="21"/>
                 <w:szCs w:val="21"/>
               </w:rPr>
-              <w:t xml:space="preserve">Jumper wires (male-male, male-female)</w:t>
+              <w:t xml:space="preserve">Jumper wires (female-female), UART option only</w:t>
             </w:r>
           </w:p>
         </w:tc>
@@ -1250,7 +1264,7 @@
                 <w:sz w:val="21"/>
                 <w:szCs w:val="21"/>
               </w:rPr>
-              <w:t xml:space="preserve">For the UART link to the Pi and any breadboard prototyping.</w:t>
+              <w:t xml:space="preserve">Only if the UART option is used: 3 wires to the Pi's GPIO header (TX, RX, GND), plus 1 for the loopback test.</w:t>
             </w:r>
           </w:p>
         </w:tc>
@@ -1570,7 +1584,7 @@
                 <w:sz w:val="21"/>
                 <w:szCs w:val="21"/>
               </w:rPr>
-              <w:t xml:space="preserve">The Pi 5 draws meaningfully more current than a Pi 4, especially under sustained inference load; an underrated supply causes brownouts, not a clean shutdown.</w:t>
+              <w:t xml:space="preserve">Plugged into a wall socket: the Pi runs on wall power and only the gloves use batteries. The Pi 5 draws meaningfully more current than a Pi 4, especially under sustained inference load; an underrated supply causes brownouts, not a clean shutdown.</w:t>
             </w:r>
           </w:p>
         </w:tc>
@@ -1666,7 +1680,7 @@
                 <w:sz w:val="21"/>
                 <w:szCs w:val="21"/>
               </w:rPr>
-              <w:t>USB speaker (or HDMI audio)</w:t>
+              <w:t xml:space="preserve">USB sound card (USB-A to 3.5 mm), 3.5 mm AUX cable and a speaker with AUX input</w:t>
             </w:r>
           </w:p>
         </w:tc>
@@ -1712,7 +1726,7 @@
                 <w:sz w:val="21"/>
                 <w:szCs w:val="21"/>
               </w:rPr>
-              <w:t>TTS audio output. The Raspberry Pi 5 has no 3.5 mm audio jack: use a USB speaker, a monitor or TV with speakers over HDMI, or a USB sound adapter for a 3.5 mm speaker. A small USB speaker avoids depending on the Pi's onboard audio configuration being correctly set up.</w:t>
+              <w:t xml:space="preserve">TTS audio output. The Raspberry Pi 5 has no 3.5 mm audio jack, so a USB sound card feeds a wired speaker with its own power. Wired rather than Bluetooth: nothing to pair or reconnect after a reboot. Set the sound card as the default output once (aplay -l should list "USB Audio").</w:t>
             </w:r>
           </w:p>
         </w:tc>
@@ -1737,7 +1751,7 @@
                 <w:sz w:val="21"/>
                 <w:szCs w:val="21"/>
               </w:rPr>
-              <w:t xml:space="preserve">Micro-HDMI to HDMI cable + monitor</w:t>
+              <w:t xml:space="preserve">Micro-HDMI to HDMI cable + monitor (with its own power)</w:t>
             </w:r>
           </w:p>
         </w:tc>
@@ -1783,7 +1797,7 @@
                 <w:sz w:val="21"/>
                 <w:szCs w:val="21"/>
               </w:rPr>
-              <w:t xml:space="preserve">For initial OS setup and debugging. Not needed for normal headless (SSH) operation once configured.</w:t>
+              <w:t xml:space="preserve">Shows the large subtitles in normal use (kiosk mode starts with the Pi), and is used for setup. Use the HDMI port next to the USB-C power port.</w:t>
             </w:r>
           </w:p>
         </w:tc>
@@ -2277,7 +2291,7 @@
           <w:sz w:val="24"/>
           <w:szCs w:val="24"/>
         </w:rPr>
-        <w:t xml:space="preserve">Both gloves use identical wiring — only the IS_LEFT_GLOVE / IS_RIGHT_GLOVE flag in config.h differs between the two firmware builds. Each flex sensor forms a simple voltage divider with a fixed resistor, and the MPU6050 shares the same 3.3V and ground rails.</w:t>
+        <w:t xml:space="preserve">Both gloves use identical wiring — only the left_glove / right_glove build differs between the two firmware builds. Each flex sensor forms a simple voltage divider with a 47 kΩ resistor, and the MPU6050 shares the same 3.3V and ground rails. Pins: J1 thumb IO34, J2 index IO35, J3 middle IO32, J4 ring IO33, J5 pinky IO36 (VP), J6 palm IO39 (VN), J7 unused; MPU6050 SDA IO21, SCL IO22; IO12 left unconnected. J5 and J6 reach IO36/IO39 by jumper wires, because their PCB tracks go to IO25/IO26 (ADC2 pins, which cannot be read while ESP-NOW transmits).</w:t>
       </w:r>
     </w:p>
     <w:p>
@@ -2339,7 +2353,7 @@
           <w:sz w:val="20"/>
           <w:szCs w:val="20"/>
         </w:rPr>
-        <w:t xml:space="preserve">Figure 1. Glove sensor wiring (one hand shown; identical for both).</w:t>
+        <w:t xml:space="preserve">Figure 1. Glove sensor wiring as built (one hand shown; identical for both).</w:t>
       </w:r>
     </w:p>
     <w:p>
@@ -2368,7 +2382,7 @@
           <w:sz w:val="24"/>
           <w:szCs w:val="24"/>
         </w:rPr>
-        <w:t xml:space="preserve">The receiver dongle connects to the Pi over a dedicated UART link, wired separately from the Pi's USB ports. Getting the crossed TX/RX wiring right, and enabling the Pi 5's hardware UART as described in the receiver firmware's README (use /dev/ttyAMA0 and verify it with a loopback test), are the two most common sources of “no data arriving” problems at this stage.</w:t>
+        <w:t xml:space="preserve">By default the receiver connects to the Pi with one USB-A to USB-C data cable, which powers it and carries the data; the Pi finds it automatically by its CH340 USB chip, so there is nothing to configure. The UART wires (receiver GPIO17/GPIO18/GND to Pi pins 10/8/6, crossed) remain an option, chosen in the app's Active mode (Receiver link). For that option only, getting the crossed TX/RX wiring right and enabling the Pi 5's hardware UART (use /dev/ttyAMA0 and verify it with a loopback test) are the two most common sources of "no data arriving" problems. The receiver sends every frame on both, so switching needs no change on the receiver.</w:t>
       </w:r>
     </w:p>
     <w:p>
@@ -2430,7 +2444,7 @@
           <w:sz w:val="20"/>
           <w:szCs w:val="20"/>
         </w:rPr>
-        <w:t xml:space="preserve">Figure 2. Receiver dongle to Raspberry Pi 5 wiring, including power and audio output.</w:t>
+        <w:t xml:space="preserve">Figure 2. Receiver dongle to Raspberry Pi 5: USB cable (default) or UART wires (option), with power, display and audio output.</w:t>
       </w:r>
     </w:p>
     <w:p>
@@ -2473,7 +2487,7 @@
           <w:sz w:val="24"/>
           <w:szCs w:val="24"/>
         </w:rPr>
-        <w:t xml:space="preserve">1. Breadboard one glove's full circuit (all 5 flex sensors + IMU) and flash the glove firmware. Use the Serial calibration routine and confirm all 5 finger readings respond sensibly before moving on.</w:t>
+        <w:t xml:space="preserve">1. Breadboard one glove's full circuit (all 6 flex sensors + IMU on IO21/IO22). Run the glove hardware check (firmware/tools/glove_hw_check) to confirm each sensor's range and that the IMU is found, then flash the glove firmware and use the Serial calibration routine (c) to confirm all 6 readings (5 fingers + palm) respond sensibly before moving on.</w:t>
       </w:r>
     </w:p>
     <w:p>
@@ -2487,7 +2501,7 @@
           <w:sz w:val="24"/>
           <w:szCs w:val="24"/>
         </w:rPr>
-        <w:t xml:space="preserve">2. Repeat step 1 for the second glove, with IS_RIGHT_GLOVE set instead.</w:t>
+        <w:t xml:space="preserve">2. Repeat step 1 for the second glove, flashing the right_glove build instead (PlatformIO environment right_glove).</w:t>
       </w:r>
     </w:p>
     <w:p>
@@ -2529,7 +2543,7 @@
           <w:sz w:val="24"/>
           <w:szCs w:val="24"/>
         </w:rPr>
-        <w:t xml:space="preserve">5. Set up the Raspberry Pi 5: flash the OS, enable the hardware UART (add dtparam=uart0=on to /boot/firmware/config.txt and reboot), and verify /dev/ttyAMA0 with a GPIO14-to-GPIO15 loopback test before wiring the receiver. Do not rely on /dev/serial0, which points to a different connector on the Pi 5. Add dtoverlay=disable-bt only if the loopback test fails.</w:t>
+        <w:t xml:space="preserve">5. Set up the Raspberry Pi 5: flash the OS and run pi-side/deploy/setup_pi.sh (steps in flashing_kit/4_Raspberry_Pi). With the default USB link nothing else is needed. UART option only: enable the hardware UART (add dtparam=uart0=on to /boot/firmware/config.txt and reboot), and verify /dev/ttyAMA0 with a GPIO14-to-GPIO15 loopback test before wiring the receiver. Do not rely on /dev/serial0, which points to a different connector on the Pi 5. Add dtoverlay=disable-bt only if the loopback test fails.</w:t>
       </w:r>
     </w:p>
     <w:p>
@@ -2543,7 +2557,7 @@
           <w:sz w:val="24"/>
           <w:szCs w:val="24"/>
         </w:rPr>
-        <w:t xml:space="preserve">6. Wire the receiver to the Pi's UART pins (crossed, plus shared ground) and confirm frames are arriving using `python tools/live_view.py --port /dev/ttyAMA0` from the pi-side folder (no model required). The main app prints nothing per frame until a model is loaded.</w:t>
+        <w:t xml:space="preserve">6. Plug the receiver into a Pi USB port with its data cable (UART option: wire it to the Pi's UART pins, crossed, plus shared ground, and choose UART wires in the app) and confirm frames are arriving using `python tools/live_view.py --duration 30` from the pi-side folder (no model required). The main app prints nothing per frame until a model is loaded.</w:t>
       </w:r>
     </w:p>
     <w:p>
@@ -2630,6 +2644,25 @@
           <w:szCs w:val="24"/>
         </w:rPr>
         <w:t xml:space="preserve">Double-check polarity on every JST battery connector before plugging in — connector keying is not always consistent across suppliers.</w:t>
+      </w:r>
+    </w:p>
+    <w:p>
+      <w:pPr>
+        <w:pStyle w:val="ListParagraph"/>
+        <w:numPr>
+          <w:ilvl w:val="0"/>
+          <w:numId w:val="1"/>
+        </w:numPr>
+        <w:spacing w:after="120" w:line="360"/>
+        <w:jc w:val="both"/>
+      </w:pPr>
+      <w:r>
+        <w:rPr>
+          <w:rFonts w:ascii="Times New Roman" w:cs="Times New Roman" w:eastAsia="Times New Roman" w:hAnsi="Times New Roman"/>
+          <w:sz w:val="24"/>
+          <w:szCs w:val="24"/>
+        </w:rPr>
+        <w:t xml:space="preserve">Never power a glove from the charger's 5V OUT and its USB port at the same time, and never connect the Pi's 5 V header pins to the receiver.</w:t>
       </w:r>
     </w:p>
     <w:sectPr>

</xml_diff>